<commit_message>
Uppdatera ytgenerering och karnfilsfloden
</commit_message>
<xml_diff>
--- a/påg.docx
+++ b/påg.docx
@@ -350,7 +350,21 @@
           <w:lang w:val="sv-SE"/>
         </w:rPr>
         <w:tab/>
-        <w:t xml:space="preserve">Jag har gjort klart rätt mycket i excelfilen nu för produktivitet. </w:t>
+        <w:t xml:space="preserve">Jag har gjort klart rätt mycket i </w:t>
+      </w:r>
+      <w:proofErr w:type="spellStart"/>
+      <w:r>
+        <w:rPr>
+          <w:lang w:val="sv-SE"/>
+        </w:rPr>
+        <w:t>excelfilen</w:t>
+      </w:r>
+      <w:proofErr w:type="spellEnd"/>
+      <w:r>
+        <w:rPr>
+          <w:lang w:val="sv-SE"/>
+        </w:rPr>
+        <w:t xml:space="preserve"> nu för produktivitet. </w:t>
       </w:r>
     </w:p>
     <w:p>
@@ -397,7 +411,21 @@
           <w:lang w:val="sv-SE"/>
         </w:rPr>
         <w:br/>
-        <w:t xml:space="preserve">               Sen ytterliggare en för Feedback och uppföljning. Jag kan skicka två som</w:t>
+        <w:t xml:space="preserve">               Sen </w:t>
+      </w:r>
+      <w:proofErr w:type="spellStart"/>
+      <w:r>
+        <w:rPr>
+          <w:lang w:val="sv-SE"/>
+        </w:rPr>
+        <w:t>ytterliggare</w:t>
+      </w:r>
+      <w:proofErr w:type="spellEnd"/>
+      <w:r>
+        <w:rPr>
+          <w:lang w:val="sv-SE"/>
+        </w:rPr>
+        <w:t xml:space="preserve"> en för Feedback och uppföljning. Jag kan skicka två som</w:t>
       </w:r>
       <w:r>
         <w:rPr>
@@ -429,7 +457,21 @@
           <w:lang w:val="sv-SE"/>
         </w:rPr>
         <w:tab/>
-        <w:t xml:space="preserve">Jag håller på med en excel som ska täcka hela husets %-beräkning, så att man </w:t>
+        <w:t xml:space="preserve">Jag håller på med en </w:t>
+      </w:r>
+      <w:proofErr w:type="spellStart"/>
+      <w:r>
+        <w:rPr>
+          <w:lang w:val="sv-SE"/>
+        </w:rPr>
+        <w:t>excel</w:t>
+      </w:r>
+      <w:proofErr w:type="spellEnd"/>
+      <w:r>
+        <w:rPr>
+          <w:lang w:val="sv-SE"/>
+        </w:rPr>
+        <w:t xml:space="preserve"> som ska täcka hela husets %-beräkning, så att man </w:t>
       </w:r>
       <w:r>
         <w:rPr>
@@ -497,18 +539,18 @@
           <w:lang w:val="sv-SE"/>
         </w:rPr>
       </w:pPr>
-    </w:p>
-    <w:p>
-      <w:pPr>
-        <w:rPr>
-          <w:lang w:val="sv-SE"/>
-        </w:rPr>
-      </w:pPr>
-      <w:r>
-        <w:rPr>
-          <w:lang w:val="sv-SE"/>
-        </w:rPr>
-        <w:t>4. Smester och Planering</w:t>
+      <w:r>
+        <w:rPr>
+          <w:lang w:val="sv-SE"/>
+        </w:rPr>
+        <w:br/>
+      </w:r>
+      <w:r>
+        <w:rPr>
+          <w:lang w:val="sv-SE"/>
+        </w:rPr>
+        <w:br/>
+        <w:t>5. Kortare ledigheter + Översikt</w:t>
       </w:r>
     </w:p>
     <w:p>
@@ -522,223 +564,35 @@
           <w:lang w:val="sv-SE"/>
         </w:rPr>
         <w:tab/>
-        <w:t xml:space="preserve">Idag så måste jag ändra vecka till vecka för att se veckonummer. </w:t>
-      </w:r>
-      <w:r>
-        <w:rPr>
-          <w:lang w:val="sv-SE"/>
-        </w:rPr>
-        <w:tab/>
-      </w:r>
-      <w:r>
-        <w:rPr>
-          <w:lang w:val="sv-SE"/>
-        </w:rPr>
-        <w:br/>
-      </w:r>
-      <w:r>
-        <w:rPr>
-          <w:noProof/>
-          <w:lang w:val="sv-SE"/>
-        </w:rPr>
-        <w:drawing>
-          <wp:inline distT="0" distB="0" distL="0" distR="0" wp14:anchorId="126B4EDB" wp14:editId="39BCF350">
-            <wp:extent cx="5760720" cy="1343025"/>
-            <wp:effectExtent l="0" t="0" r="0" b="9525"/>
-            <wp:docPr id="927385812" name="Bildobjekt 1"/>
-            <wp:cNvGraphicFramePr>
-              <a:graphicFrameLocks xmlns:a="http://schemas.openxmlformats.org/drawingml/2006/main" noChangeAspect="1"/>
-            </wp:cNvGraphicFramePr>
-            <a:graphic xmlns:a="http://schemas.openxmlformats.org/drawingml/2006/main">
-              <a:graphicData uri="http://schemas.openxmlformats.org/drawingml/2006/picture">
-                <pic:pic xmlns:pic="http://schemas.openxmlformats.org/drawingml/2006/picture">
-                  <pic:nvPicPr>
-                    <pic:cNvPr id="927385812" name=""/>
-                    <pic:cNvPicPr/>
-                  </pic:nvPicPr>
-                  <pic:blipFill>
-                    <a:blip r:embed="rId6"/>
-                    <a:stretch>
-                      <a:fillRect/>
-                    </a:stretch>
-                  </pic:blipFill>
-                  <pic:spPr>
-                    <a:xfrm>
-                      <a:off x="0" y="0"/>
-                      <a:ext cx="5760720" cy="1343025"/>
-                    </a:xfrm>
-                    <a:prstGeom prst="rect">
-                      <a:avLst/>
-                    </a:prstGeom>
-                  </pic:spPr>
-                </pic:pic>
-              </a:graphicData>
-            </a:graphic>
-          </wp:inline>
-        </w:drawing>
-      </w:r>
-      <w:r>
-        <w:rPr>
-          <w:lang w:val="sv-SE"/>
-        </w:rPr>
-        <w:br/>
-      </w:r>
-      <w:r>
-        <w:rPr>
-          <w:lang w:val="sv-SE"/>
-        </w:rPr>
-        <w:br/>
-        <w:t xml:space="preserve">Om jag ändrar till månad blir det: </w:t>
-      </w:r>
-    </w:p>
-    <w:p>
-      <w:pPr>
-        <w:rPr>
-          <w:lang w:val="sv-SE"/>
-        </w:rPr>
-      </w:pPr>
-      <w:r>
-        <w:rPr>
-          <w:noProof/>
-          <w:lang w:val="sv-SE"/>
-        </w:rPr>
-        <w:drawing>
-          <wp:inline distT="0" distB="0" distL="0" distR="0" wp14:anchorId="20CF100B" wp14:editId="42A73084">
-            <wp:extent cx="5760720" cy="428625"/>
-            <wp:effectExtent l="0" t="0" r="0" b="9525"/>
-            <wp:docPr id="1015756122" name="Bildobjekt 1"/>
-            <wp:cNvGraphicFramePr>
-              <a:graphicFrameLocks xmlns:a="http://schemas.openxmlformats.org/drawingml/2006/main" noChangeAspect="1"/>
-            </wp:cNvGraphicFramePr>
-            <a:graphic xmlns:a="http://schemas.openxmlformats.org/drawingml/2006/main">
-              <a:graphicData uri="http://schemas.openxmlformats.org/drawingml/2006/picture">
-                <pic:pic xmlns:pic="http://schemas.openxmlformats.org/drawingml/2006/picture">
-                  <pic:nvPicPr>
-                    <pic:cNvPr id="1015756122" name=""/>
-                    <pic:cNvPicPr/>
-                  </pic:nvPicPr>
-                  <pic:blipFill>
-                    <a:blip r:embed="rId7"/>
-                    <a:stretch>
-                      <a:fillRect/>
-                    </a:stretch>
-                  </pic:blipFill>
-                  <pic:spPr>
-                    <a:xfrm>
-                      <a:off x="0" y="0"/>
-                      <a:ext cx="5760720" cy="428625"/>
-                    </a:xfrm>
-                    <a:prstGeom prst="rect">
-                      <a:avLst/>
-                    </a:prstGeom>
-                  </pic:spPr>
-                </pic:pic>
-              </a:graphicData>
-            </a:graphic>
-          </wp:inline>
-        </w:drawing>
-      </w:r>
-      <w:r>
-        <w:rPr>
-          <w:lang w:val="sv-SE"/>
-        </w:rPr>
-        <w:br/>
-      </w:r>
-      <w:r>
-        <w:rPr>
-          <w:lang w:val="sv-SE"/>
-        </w:rPr>
-        <w:br/>
-        <w:t xml:space="preserve">Om någon har sökt 4 veckor semester: vecka 24-27. </w:t>
-      </w:r>
-      <w:r>
-        <w:rPr>
-          <w:lang w:val="sv-SE"/>
-        </w:rPr>
-        <w:br/>
-        <w:t xml:space="preserve">Så måste jag antingen gå upp och ändra i vecka hela tiden eller sitta med telefon och kallender för att dubbelkolla datum i månadsvyn. </w:t>
-      </w:r>
-      <w:r>
-        <w:rPr>
-          <w:lang w:val="sv-SE"/>
-        </w:rPr>
-        <w:br/>
-        <w:t xml:space="preserve">Förslag: Under Dag och Datum, kan man inte ha med veckonummer? </w:t>
-      </w:r>
-      <w:r>
-        <w:rPr>
-          <w:lang w:val="sv-SE"/>
-        </w:rPr>
-        <w:br/>
-      </w:r>
-      <w:r>
-        <w:rPr>
-          <w:noProof/>
-          <w:lang w:val="sv-SE"/>
-        </w:rPr>
-        <w:drawing>
-          <wp:inline distT="0" distB="0" distL="0" distR="0" wp14:anchorId="22FD0C79" wp14:editId="60D45399">
-            <wp:extent cx="2743583" cy="1114581"/>
-            <wp:effectExtent l="0" t="0" r="0" b="9525"/>
-            <wp:docPr id="1191508357" name="Bildobjekt 1"/>
-            <wp:cNvGraphicFramePr>
-              <a:graphicFrameLocks xmlns:a="http://schemas.openxmlformats.org/drawingml/2006/main" noChangeAspect="1"/>
-            </wp:cNvGraphicFramePr>
-            <a:graphic xmlns:a="http://schemas.openxmlformats.org/drawingml/2006/main">
-              <a:graphicData uri="http://schemas.openxmlformats.org/drawingml/2006/picture">
-                <pic:pic xmlns:pic="http://schemas.openxmlformats.org/drawingml/2006/picture">
-                  <pic:nvPicPr>
-                    <pic:cNvPr id="1191508357" name=""/>
-                    <pic:cNvPicPr/>
-                  </pic:nvPicPr>
-                  <pic:blipFill>
-                    <a:blip r:embed="rId8"/>
-                    <a:stretch>
-                      <a:fillRect/>
-                    </a:stretch>
-                  </pic:blipFill>
-                  <pic:spPr>
-                    <a:xfrm>
-                      <a:off x="0" y="0"/>
-                      <a:ext cx="2743583" cy="1114581"/>
-                    </a:xfrm>
-                    <a:prstGeom prst="rect">
-                      <a:avLst/>
-                    </a:prstGeom>
-                  </pic:spPr>
-                </pic:pic>
-              </a:graphicData>
-            </a:graphic>
-          </wp:inline>
-        </w:drawing>
-      </w:r>
-      <w:r>
-        <w:rPr>
-          <w:lang w:val="sv-SE"/>
-        </w:rPr>
-        <w:br/>
-      </w:r>
-      <w:r>
-        <w:rPr>
-          <w:lang w:val="sv-SE"/>
-        </w:rPr>
-        <w:lastRenderedPageBreak/>
-        <w:br/>
-        <w:t>5. Kortare ledigheter + Översikt</w:t>
-      </w:r>
-    </w:p>
-    <w:p>
-      <w:pPr>
-        <w:rPr>
-          <w:lang w:val="sv-SE"/>
-        </w:rPr>
-      </w:pPr>
-      <w:r>
-        <w:rPr>
-          <w:lang w:val="sv-SE"/>
-        </w:rPr>
-        <w:tab/>
-        <w:t>I dessa vecko och måndasvyer så kan man inte se om någon har fått ledigt delar</w:t>
+        <w:t xml:space="preserve">I dessa </w:t>
+      </w:r>
+      <w:proofErr w:type="spellStart"/>
+      <w:r>
+        <w:rPr>
+          <w:lang w:val="sv-SE"/>
+        </w:rPr>
+        <w:t>vecko</w:t>
+      </w:r>
+      <w:proofErr w:type="spellEnd"/>
+      <w:r>
+        <w:rPr>
+          <w:lang w:val="sv-SE"/>
+        </w:rPr>
+        <w:t xml:space="preserve"> och </w:t>
+      </w:r>
+      <w:proofErr w:type="spellStart"/>
+      <w:r>
+        <w:rPr>
+          <w:lang w:val="sv-SE"/>
+        </w:rPr>
+        <w:t>måndasvyer</w:t>
+      </w:r>
+      <w:proofErr w:type="spellEnd"/>
+      <w:r>
+        <w:rPr>
+          <w:lang w:val="sv-SE"/>
+        </w:rPr>
+        <w:t xml:space="preserve"> så kan man inte se om någon har fått ledigt delar</w:t>
       </w:r>
       <w:r>
         <w:rPr>
@@ -802,7 +656,21 @@
         <w:rPr>
           <w:lang w:val="sv-SE"/>
         </w:rPr>
-        <w:t>Då vi aldrig planerar framåt att dem ska köra halvdagar, utan det tar vi dag för dag, tänker jag att istället för "blandat" kanske då det kan stå "delvis ledig". eller likanade? </w:t>
+        <w:t xml:space="preserve">Då vi aldrig planerar framåt att dem ska köra halvdagar, utan det tar vi dag för dag, tänker jag att istället för "blandat" kanske då det kan stå "delvis ledig". eller </w:t>
+      </w:r>
+      <w:proofErr w:type="spellStart"/>
+      <w:r>
+        <w:rPr>
+          <w:lang w:val="sv-SE"/>
+        </w:rPr>
+        <w:t>likanade</w:t>
+      </w:r>
+      <w:proofErr w:type="spellEnd"/>
+      <w:r>
+        <w:rPr>
+          <w:lang w:val="sv-SE"/>
+        </w:rPr>
+        <w:t>? </w:t>
       </w:r>
     </w:p>
     <w:p>
@@ -841,7 +709,21 @@
         <w:rPr>
           <w:lang w:val="sv-SE"/>
         </w:rPr>
-        <w:t>Detta med Delvis ledigt är lite för att säg, conny får en ledighets ansökan. Han har glömt fylla i den. Så kan han snabbare se den i månadsöversikten bara genom att skrolla. Eller om man bara tittar över nästa vecka typ "vilken vecka kom x tillbaka fulltid?" </w:t>
+        <w:t xml:space="preserve">Detta med Delvis ledigt är lite för att säg, </w:t>
+      </w:r>
+      <w:proofErr w:type="spellStart"/>
+      <w:r>
+        <w:rPr>
+          <w:lang w:val="sv-SE"/>
+        </w:rPr>
+        <w:t>conny</w:t>
+      </w:r>
+      <w:proofErr w:type="spellEnd"/>
+      <w:r>
+        <w:rPr>
+          <w:lang w:val="sv-SE"/>
+        </w:rPr>
+        <w:t xml:space="preserve"> får en ledighets ansökan. Han har glömt fylla i den. Så kan han snabbare se den i månadsöversikten bara genom att skrolla. Eller om man bara tittar över nästa vecka typ "vilken vecka kom x tillbaka fulltid?" </w:t>
       </w:r>
     </w:p>
     <w:p>
@@ -871,7 +753,7 @@
       </w:r>
       <w:r>
         <w:rPr>
-          <w:lang w:val="en-US"/>
+          <w:noProof/>
         </w:rPr>
         <w:drawing>
           <wp:inline distT="0" distB="0" distL="0" distR="0" wp14:anchorId="347FB8BA" wp14:editId="71BF7790">
@@ -891,7 +773,7 @@
                     </pic:cNvPicPr>
                   </pic:nvPicPr>
                   <pic:blipFill>
-                    <a:blip r:embed="rId9">
+                    <a:blip r:embed="rId6">
                       <a:extLst>
                         <a:ext uri="{28A0092B-C50C-407E-A947-70E740481C1C}">
                           <a14:useLocalDpi xmlns:a14="http://schemas.microsoft.com/office/drawing/2010/main" val="0"/>
@@ -939,6 +821,7 @@
         <w:rPr>
           <w:lang w:val="sv-SE"/>
         </w:rPr>
+        <w:lastRenderedPageBreak/>
         <w:t> </w:t>
       </w:r>
     </w:p>
@@ -956,7 +839,7 @@
       </w:r>
       <w:r>
         <w:rPr>
-          <w:lang w:val="en-US"/>
+          <w:noProof/>
         </w:rPr>
         <w:drawing>
           <wp:inline distT="0" distB="0" distL="0" distR="0" wp14:anchorId="22DE85B9" wp14:editId="5C1A1AB5">
@@ -976,7 +859,7 @@
                     </pic:cNvPicPr>
                   </pic:nvPicPr>
                   <pic:blipFill>
-                    <a:blip r:embed="rId9">
+                    <a:blip r:embed="rId6">
                       <a:extLst>
                         <a:ext uri="{28A0092B-C50C-407E-A947-70E740481C1C}">
                           <a14:useLocalDpi xmlns:a14="http://schemas.microsoft.com/office/drawing/2010/main" val="0"/>
@@ -1141,202 +1024,258 @@
         <w:rPr>
           <w:lang w:val="sv-SE"/>
         </w:rPr>
+        <w:t xml:space="preserve">Har ju dock börjat lära mig att "If </w:t>
+      </w:r>
+      <w:proofErr w:type="spellStart"/>
+      <w:r>
+        <w:rPr>
+          <w:lang w:val="sv-SE"/>
+        </w:rPr>
+        <w:t>you</w:t>
+      </w:r>
+      <w:proofErr w:type="spellEnd"/>
+      <w:r>
+        <w:rPr>
+          <w:lang w:val="sv-SE"/>
+        </w:rPr>
+        <w:t xml:space="preserve"> </w:t>
+      </w:r>
+      <w:proofErr w:type="spellStart"/>
+      <w:r>
+        <w:rPr>
+          <w:lang w:val="sv-SE"/>
+        </w:rPr>
+        <w:t>can</w:t>
+      </w:r>
+      <w:proofErr w:type="spellEnd"/>
+      <w:r>
+        <w:rPr>
+          <w:lang w:val="sv-SE"/>
+        </w:rPr>
+        <w:t xml:space="preserve"> Dream it, Emir </w:t>
+      </w:r>
+      <w:proofErr w:type="spellStart"/>
+      <w:r>
+        <w:rPr>
+          <w:lang w:val="sv-SE"/>
+        </w:rPr>
+        <w:t>can</w:t>
+      </w:r>
+      <w:proofErr w:type="spellEnd"/>
+      <w:r>
+        <w:rPr>
+          <w:lang w:val="sv-SE"/>
+        </w:rPr>
+        <w:t xml:space="preserve"> </w:t>
+      </w:r>
+      <w:proofErr w:type="spellStart"/>
+      <w:r>
+        <w:rPr>
+          <w:lang w:val="sv-SE"/>
+        </w:rPr>
+        <w:t>build</w:t>
+      </w:r>
+      <w:proofErr w:type="spellEnd"/>
+      <w:r>
+        <w:rPr>
+          <w:lang w:val="sv-SE"/>
+        </w:rPr>
+        <w:t xml:space="preserve"> it" haha</w:t>
+      </w:r>
+    </w:p>
+    <w:p>
+      <w:pPr>
+        <w:rPr>
+          <w:lang w:val="sv-SE"/>
+        </w:rPr>
+      </w:pPr>
+      <w:r>
+        <w:rPr>
+          <w:lang w:val="sv-SE"/>
+        </w:rPr>
+        <w:t> </w:t>
+      </w:r>
+    </w:p>
+    <w:p>
+      <w:pPr>
+        <w:rPr>
+          <w:lang w:val="sv-SE"/>
+        </w:rPr>
+      </w:pPr>
+      <w:r>
+        <w:rPr>
+          <w:lang w:val="sv-SE"/>
+        </w:rPr>
+        <w:t>Tips till Bemanning: </w:t>
+      </w:r>
+    </w:p>
+    <w:p>
+      <w:pPr>
+        <w:rPr>
+          <w:lang w:val="sv-SE"/>
+        </w:rPr>
+      </w:pPr>
+      <w:r>
+        <w:rPr>
+          <w:lang w:val="sv-SE"/>
+        </w:rPr>
+        <w:t> </w:t>
+      </w:r>
+    </w:p>
+    <w:p>
+      <w:pPr>
+        <w:rPr>
+          <w:lang w:val="sv-SE"/>
+        </w:rPr>
+      </w:pPr>
+      <w:r>
+        <w:rPr>
+          <w:lang w:val="sv-SE"/>
+        </w:rPr>
+        <w:t>Vid Brandövning eller Skarpt läge.</w:t>
+      </w:r>
+    </w:p>
+    <w:p>
+      <w:pPr>
+        <w:rPr>
+          <w:lang w:val="sv-SE"/>
+        </w:rPr>
+      </w:pPr>
+      <w:r>
+        <w:rPr>
+          <w:lang w:val="sv-SE"/>
+        </w:rPr>
+        <w:t>Ett sätt att få ut alla som är närvarande för dagen så att man vid samlingsplats kan bocka av alla arbetstagare. </w:t>
+      </w:r>
+    </w:p>
+    <w:p>
+      <w:pPr>
+        <w:rPr>
+          <w:lang w:val="sv-SE"/>
+        </w:rPr>
+      </w:pPr>
+      <w:r>
+        <w:rPr>
+          <w:lang w:val="sv-SE"/>
+        </w:rPr>
+        <w:t>Detta för att säkerställa att ingen har glömts kvar där inne av någon anledning och lätt kunna berätta för brandkår vid ankomst om man saknar något antal av personer. </w:t>
+      </w:r>
+    </w:p>
+    <w:p>
+      <w:pPr>
+        <w:rPr>
+          <w:lang w:val="sv-SE"/>
+        </w:rPr>
+      </w:pPr>
+      <w:r>
+        <w:rPr>
+          <w:lang w:val="sv-SE"/>
+        </w:rPr>
+        <w:t> </w:t>
+      </w:r>
+    </w:p>
+    <w:p>
+      <w:pPr>
+        <w:rPr>
+          <w:lang w:val="sv-SE"/>
+        </w:rPr>
+      </w:pPr>
+      <w:r>
+        <w:rPr>
+          <w:lang w:val="sv-SE"/>
+        </w:rPr>
+        <w:t>Förklaring till Luddet: </w:t>
+      </w:r>
+    </w:p>
+    <w:p>
+      <w:pPr>
+        <w:rPr>
+          <w:lang w:val="sv-SE"/>
+        </w:rPr>
+      </w:pPr>
+      <w:r>
+        <w:rPr>
+          <w:lang w:val="sv-SE"/>
+        </w:rPr>
+        <w:t> </w:t>
+      </w:r>
+    </w:p>
+    <w:p>
+      <w:pPr>
+        <w:rPr>
+          <w:lang w:val="sv-SE"/>
+        </w:rPr>
+      </w:pPr>
+      <w:r>
+        <w:rPr>
+          <w:lang w:val="sv-SE"/>
+        </w:rPr>
+        <w:t>"Att Sortera". </w:t>
+      </w:r>
+    </w:p>
+    <w:p>
+      <w:pPr>
+        <w:rPr>
+          <w:lang w:val="sv-SE"/>
+        </w:rPr>
+      </w:pPr>
+      <w:r>
+        <w:rPr>
+          <w:lang w:val="sv-SE"/>
+        </w:rPr>
+        <w:t> </w:t>
+      </w:r>
+    </w:p>
+    <w:p>
+      <w:pPr>
+        <w:rPr>
+          <w:lang w:val="sv-SE"/>
+        </w:rPr>
+      </w:pPr>
+      <w:r>
+        <w:rPr>
+          <w:lang w:val="sv-SE"/>
+        </w:rPr>
+        <w:t>Jag skickar X till Mestergruppen. 5 timmar:</w:t>
+      </w:r>
+    </w:p>
+    <w:p>
+      <w:pPr>
+        <w:rPr>
+          <w:lang w:val="sv-SE"/>
+        </w:rPr>
+      </w:pPr>
+      <w:r>
+        <w:rPr>
+          <w:lang w:val="sv-SE"/>
+        </w:rPr>
+        <w:t> </w:t>
+      </w:r>
+    </w:p>
+    <w:p>
+      <w:pPr>
+        <w:rPr>
+          <w:lang w:val="sv-SE"/>
+        </w:rPr>
+      </w:pPr>
+      <w:r>
+        <w:rPr>
+          <w:lang w:val="sv-SE"/>
+        </w:rPr>
+        <w:t>Då ser Amir följande på sin sida: </w:t>
+      </w:r>
+    </w:p>
+    <w:p>
+      <w:pPr>
+        <w:rPr>
+          <w:lang w:val="sv-SE"/>
+        </w:rPr>
+      </w:pPr>
+      <w:r>
+        <w:rPr>
+          <w:lang w:val="sv-SE"/>
+        </w:rPr>
         <w:lastRenderedPageBreak/>
-        <w:t>Har ju dock börjat lära mig att "If you can Dream it, Emir can build it" haha</w:t>
-      </w:r>
-    </w:p>
-    <w:p>
-      <w:pPr>
-        <w:rPr>
-          <w:lang w:val="sv-SE"/>
-        </w:rPr>
-      </w:pPr>
-      <w:r>
-        <w:rPr>
-          <w:lang w:val="sv-SE"/>
-        </w:rPr>
-        <w:t> </w:t>
-      </w:r>
-    </w:p>
-    <w:p>
-      <w:pPr>
-        <w:rPr>
-          <w:lang w:val="sv-SE"/>
-        </w:rPr>
-      </w:pPr>
-      <w:r>
-        <w:rPr>
-          <w:lang w:val="sv-SE"/>
-        </w:rPr>
-        <w:t>Tips till Bemanning: </w:t>
-      </w:r>
-    </w:p>
-    <w:p>
-      <w:pPr>
-        <w:rPr>
-          <w:lang w:val="sv-SE"/>
-        </w:rPr>
-      </w:pPr>
-      <w:r>
-        <w:rPr>
-          <w:lang w:val="sv-SE"/>
-        </w:rPr>
-        <w:t> </w:t>
-      </w:r>
-    </w:p>
-    <w:p>
-      <w:pPr>
-        <w:rPr>
-          <w:lang w:val="sv-SE"/>
-        </w:rPr>
-      </w:pPr>
-      <w:r>
-        <w:rPr>
-          <w:lang w:val="sv-SE"/>
-        </w:rPr>
-        <w:t>Vid Brandövning eller Skarpt läge.</w:t>
-      </w:r>
-    </w:p>
-    <w:p>
-      <w:pPr>
-        <w:rPr>
-          <w:lang w:val="sv-SE"/>
-        </w:rPr>
-      </w:pPr>
-      <w:r>
-        <w:rPr>
-          <w:lang w:val="sv-SE"/>
-        </w:rPr>
-        <w:t>Ett sätt att få ut alla som är närvarande för dagen så att man vid samlingsplats kan bocka av alla arbetstagare. </w:t>
-      </w:r>
-    </w:p>
-    <w:p>
-      <w:pPr>
-        <w:rPr>
-          <w:lang w:val="sv-SE"/>
-        </w:rPr>
-      </w:pPr>
-      <w:r>
-        <w:rPr>
-          <w:lang w:val="sv-SE"/>
-        </w:rPr>
-        <w:t>Detta för att säkerställa att ingen har glömts kvar där inne av någon anledning och lätt kunna berätta för brandkår vid ankomst om man saknar något antal av personer. </w:t>
-      </w:r>
-    </w:p>
-    <w:p>
-      <w:pPr>
-        <w:rPr>
-          <w:lang w:val="sv-SE"/>
-        </w:rPr>
-      </w:pPr>
-      <w:r>
-        <w:rPr>
-          <w:lang w:val="sv-SE"/>
-        </w:rPr>
-        <w:t> </w:t>
-      </w:r>
-    </w:p>
-    <w:p>
-      <w:pPr>
-        <w:rPr>
-          <w:lang w:val="sv-SE"/>
-        </w:rPr>
-      </w:pPr>
-      <w:r>
-        <w:rPr>
-          <w:lang w:val="sv-SE"/>
-        </w:rPr>
-        <w:t>Förklaring till Luddet: </w:t>
-      </w:r>
-    </w:p>
-    <w:p>
-      <w:pPr>
-        <w:rPr>
-          <w:lang w:val="sv-SE"/>
-        </w:rPr>
-      </w:pPr>
-      <w:r>
-        <w:rPr>
-          <w:lang w:val="sv-SE"/>
-        </w:rPr>
-        <w:t> </w:t>
-      </w:r>
-    </w:p>
-    <w:p>
-      <w:pPr>
-        <w:rPr>
-          <w:lang w:val="sv-SE"/>
-        </w:rPr>
-      </w:pPr>
-      <w:r>
-        <w:rPr>
-          <w:lang w:val="sv-SE"/>
-        </w:rPr>
-        <w:t>"Att Sortera". </w:t>
-      </w:r>
-    </w:p>
-    <w:p>
-      <w:pPr>
-        <w:rPr>
-          <w:lang w:val="sv-SE"/>
-        </w:rPr>
-      </w:pPr>
-      <w:r>
-        <w:rPr>
-          <w:lang w:val="sv-SE"/>
-        </w:rPr>
-        <w:t> </w:t>
-      </w:r>
-    </w:p>
-    <w:p>
-      <w:pPr>
-        <w:rPr>
-          <w:lang w:val="sv-SE"/>
-        </w:rPr>
-      </w:pPr>
-      <w:r>
-        <w:rPr>
-          <w:lang w:val="sv-SE"/>
-        </w:rPr>
-        <w:t>Jag skickar X till Mestergruppen. 5 timmar:</w:t>
-      </w:r>
-    </w:p>
-    <w:p>
-      <w:pPr>
-        <w:rPr>
-          <w:lang w:val="sv-SE"/>
-        </w:rPr>
-      </w:pPr>
-      <w:r>
-        <w:rPr>
-          <w:lang w:val="sv-SE"/>
-        </w:rPr>
-        <w:t> </w:t>
-      </w:r>
-    </w:p>
-    <w:p>
-      <w:pPr>
-        <w:rPr>
-          <w:lang w:val="sv-SE"/>
-        </w:rPr>
-      </w:pPr>
-      <w:r>
-        <w:rPr>
-          <w:lang w:val="sv-SE"/>
-        </w:rPr>
-        <w:t>Då ser Amir följande på sin sida: </w:t>
-      </w:r>
-    </w:p>
-    <w:p>
-      <w:pPr>
-        <w:rPr>
-          <w:lang w:val="sv-SE"/>
-        </w:rPr>
-      </w:pPr>
-      <w:r>
-        <w:rPr>
-          <w:lang w:val="sv-SE"/>
-        </w:rPr>
         <w:t> </w:t>
       </w:r>
     </w:p>
@@ -1376,7 +1315,21 @@
         <w:rPr>
           <w:lang w:val="sv-SE"/>
         </w:rPr>
-        <w:t>Då går Amir över till GG's sida för att ändra det efter behovet som fanns. exempel: </w:t>
+        <w:t xml:space="preserve">Då går Amir över till </w:t>
+      </w:r>
+      <w:proofErr w:type="spellStart"/>
+      <w:r>
+        <w:rPr>
+          <w:lang w:val="sv-SE"/>
+        </w:rPr>
+        <w:t>GG's</w:t>
+      </w:r>
+      <w:proofErr w:type="spellEnd"/>
+      <w:r>
+        <w:rPr>
+          <w:lang w:val="sv-SE"/>
+        </w:rPr>
+        <w:t xml:space="preserve"> sida för att ändra det efter behovet som fanns. exempel: </w:t>
       </w:r>
     </w:p>
     <w:p>
@@ -1467,6 +1420,215 @@
         <w:rPr>
           <w:lang w:val="sv-SE"/>
         </w:rPr>
+        <w:t> </w:t>
+      </w:r>
+    </w:p>
+    <w:p>
+      <w:pPr>
+        <w:rPr>
+          <w:lang w:val="sv-SE"/>
+        </w:rPr>
+      </w:pPr>
+      <w:r>
+        <w:rPr>
+          <w:lang w:val="sv-SE"/>
+        </w:rPr>
+        <w:t>Men för att inte missa det, så hamnar det på "Att Sortera". </w:t>
+      </w:r>
+    </w:p>
+    <w:p>
+      <w:pPr>
+        <w:rPr>
+          <w:lang w:val="sv-SE"/>
+        </w:rPr>
+      </w:pPr>
+      <w:r>
+        <w:rPr>
+          <w:lang w:val="sv-SE"/>
+        </w:rPr>
+        <w:t>Skulle man glömma att ändra det till MG VM eller MG Plock som i detta exempel. </w:t>
+      </w:r>
+    </w:p>
+    <w:p>
+      <w:pPr>
+        <w:rPr>
+          <w:lang w:val="sv-SE"/>
+        </w:rPr>
+      </w:pPr>
+      <w:r>
+        <w:rPr>
+          <w:lang w:val="sv-SE"/>
+        </w:rPr>
+        <w:t> </w:t>
+      </w:r>
+    </w:p>
+    <w:p>
+      <w:pPr>
+        <w:rPr>
+          <w:lang w:val="sv-SE"/>
+        </w:rPr>
+      </w:pPr>
+      <w:r>
+        <w:rPr>
+          <w:lang w:val="sv-SE"/>
+        </w:rPr>
+        <w:t>Så räknas "Mestergruppen" som Stöd timmar. </w:t>
+      </w:r>
+    </w:p>
+    <w:p>
+      <w:pPr>
+        <w:rPr>
+          <w:lang w:val="sv-SE"/>
+        </w:rPr>
+      </w:pPr>
+      <w:r>
+        <w:rPr>
+          <w:lang w:val="sv-SE"/>
+        </w:rPr>
+        <w:t> </w:t>
+      </w:r>
+    </w:p>
+    <w:p>
+      <w:pPr>
+        <w:rPr>
+          <w:lang w:val="sv-SE"/>
+        </w:rPr>
+      </w:pPr>
+      <w:r>
+        <w:rPr>
+          <w:lang w:val="sv-SE"/>
+        </w:rPr>
+        <w:t> </w:t>
+      </w:r>
+    </w:p>
+    <w:p>
+      <w:pPr>
+        <w:rPr>
+          <w:lang w:val="sv-SE"/>
+        </w:rPr>
+      </w:pPr>
+      <w:r>
+        <w:rPr>
+          <w:lang w:val="sv-SE"/>
+        </w:rPr>
+        <w:t>---------------------</w:t>
+      </w:r>
+    </w:p>
+    <w:p>
+      <w:pPr>
+        <w:rPr>
+          <w:lang w:val="sv-SE"/>
+        </w:rPr>
+      </w:pPr>
+      <w:r>
+        <w:rPr>
+          <w:lang w:val="sv-SE"/>
+        </w:rPr>
+        <w:t> </w:t>
+      </w:r>
+    </w:p>
+    <w:p>
+      <w:pPr>
+        <w:rPr>
+          <w:lang w:val="sv-SE"/>
+        </w:rPr>
+      </w:pPr>
+      <w:r>
+        <w:rPr>
+          <w:lang w:val="sv-SE"/>
+        </w:rPr>
+        <w:t xml:space="preserve">Detta skapades eftersom att vi varje månad diffade på vad som fanns i </w:t>
+      </w:r>
+      <w:proofErr w:type="spellStart"/>
+      <w:r>
+        <w:rPr>
+          <w:lang w:val="sv-SE"/>
+        </w:rPr>
+        <w:t>agda</w:t>
+      </w:r>
+      <w:proofErr w:type="spellEnd"/>
+      <w:r>
+        <w:rPr>
+          <w:lang w:val="sv-SE"/>
+        </w:rPr>
+        <w:t xml:space="preserve"> kontra bemanningsfilen. </w:t>
+      </w:r>
+    </w:p>
+    <w:p>
+      <w:pPr>
+        <w:rPr>
+          <w:lang w:val="sv-SE"/>
+        </w:rPr>
+      </w:pPr>
+      <w:r>
+        <w:rPr>
+          <w:lang w:val="sv-SE"/>
+        </w:rPr>
+        <w:t>Såklart kan det vara att man glömmer fylla i någon timme, men ibland försvann hela individer. </w:t>
+      </w:r>
+    </w:p>
+    <w:p>
+      <w:pPr>
+        <w:rPr>
+          <w:lang w:val="sv-SE"/>
+        </w:rPr>
+      </w:pPr>
+      <w:r>
+        <w:rPr>
+          <w:lang w:val="sv-SE"/>
+        </w:rPr>
+        <w:t>På detta vis så finns alla ALLTID kvar på sina Utgångspunkter och ingen timme ska riskeras att missas då man har ett standard schema.  </w:t>
+      </w:r>
+    </w:p>
+    <w:p>
+      <w:pPr>
+        <w:rPr>
+          <w:lang w:val="sv-SE"/>
+        </w:rPr>
+      </w:pPr>
+      <w:r>
+        <w:rPr>
+          <w:lang w:val="sv-SE"/>
+        </w:rPr>
+        <w:t>Exempel: </w:t>
+      </w:r>
+    </w:p>
+    <w:p>
+      <w:pPr>
+        <w:rPr>
+          <w:lang w:val="sv-SE"/>
+        </w:rPr>
+      </w:pPr>
+      <w:r>
+        <w:rPr>
+          <w:lang w:val="sv-SE"/>
+        </w:rPr>
+        <w:t> </w:t>
+      </w:r>
+    </w:p>
+    <w:p>
+      <w:pPr>
+        <w:rPr>
+          <w:lang w:val="sv-SE"/>
+        </w:rPr>
+      </w:pPr>
+      <w:r>
+        <w:rPr>
+          <w:lang w:val="sv-SE"/>
+        </w:rPr>
+        <w:t>Man ändrar det under dagen som går: </w:t>
+      </w:r>
+    </w:p>
+    <w:p>
+      <w:pPr>
+        <w:rPr>
+          <w:lang w:val="sv-SE"/>
+        </w:rPr>
+      </w:pPr>
+      <w:r>
+        <w:rPr>
+          <w:lang w:val="sv-SE"/>
+        </w:rPr>
         <w:lastRenderedPageBreak/>
         <w:t> </w:t>
       </w:r>
@@ -1481,201 +1643,6 @@
         <w:rPr>
           <w:lang w:val="sv-SE"/>
         </w:rPr>
-        <w:t>Men för att inte missa det, så hamnar det på "Att Sortera". </w:t>
-      </w:r>
-    </w:p>
-    <w:p>
-      <w:pPr>
-        <w:rPr>
-          <w:lang w:val="sv-SE"/>
-        </w:rPr>
-      </w:pPr>
-      <w:r>
-        <w:rPr>
-          <w:lang w:val="sv-SE"/>
-        </w:rPr>
-        <w:t>Skulle man glömma att ändra det till MG VM eller MG Plock som i detta exempel. </w:t>
-      </w:r>
-    </w:p>
-    <w:p>
-      <w:pPr>
-        <w:rPr>
-          <w:lang w:val="sv-SE"/>
-        </w:rPr>
-      </w:pPr>
-      <w:r>
-        <w:rPr>
-          <w:lang w:val="sv-SE"/>
-        </w:rPr>
-        <w:t> </w:t>
-      </w:r>
-    </w:p>
-    <w:p>
-      <w:pPr>
-        <w:rPr>
-          <w:lang w:val="sv-SE"/>
-        </w:rPr>
-      </w:pPr>
-      <w:r>
-        <w:rPr>
-          <w:lang w:val="sv-SE"/>
-        </w:rPr>
-        <w:t>Så räknas "Mestergruppen" som Stöd timmar. </w:t>
-      </w:r>
-    </w:p>
-    <w:p>
-      <w:pPr>
-        <w:rPr>
-          <w:lang w:val="sv-SE"/>
-        </w:rPr>
-      </w:pPr>
-      <w:r>
-        <w:rPr>
-          <w:lang w:val="sv-SE"/>
-        </w:rPr>
-        <w:t> </w:t>
-      </w:r>
-    </w:p>
-    <w:p>
-      <w:pPr>
-        <w:rPr>
-          <w:lang w:val="sv-SE"/>
-        </w:rPr>
-      </w:pPr>
-      <w:r>
-        <w:rPr>
-          <w:lang w:val="sv-SE"/>
-        </w:rPr>
-        <w:t> </w:t>
-      </w:r>
-    </w:p>
-    <w:p>
-      <w:pPr>
-        <w:rPr>
-          <w:lang w:val="sv-SE"/>
-        </w:rPr>
-      </w:pPr>
-      <w:r>
-        <w:rPr>
-          <w:lang w:val="sv-SE"/>
-        </w:rPr>
-        <w:t>---------------------</w:t>
-      </w:r>
-    </w:p>
-    <w:p>
-      <w:pPr>
-        <w:rPr>
-          <w:lang w:val="sv-SE"/>
-        </w:rPr>
-      </w:pPr>
-      <w:r>
-        <w:rPr>
-          <w:lang w:val="sv-SE"/>
-        </w:rPr>
-        <w:t> </w:t>
-      </w:r>
-    </w:p>
-    <w:p>
-      <w:pPr>
-        <w:rPr>
-          <w:lang w:val="sv-SE"/>
-        </w:rPr>
-      </w:pPr>
-      <w:r>
-        <w:rPr>
-          <w:lang w:val="sv-SE"/>
-        </w:rPr>
-        <w:t>Detta skapades eftersom att vi varje månad diffade på vad som fanns i agda kontra bemanningsfilen. </w:t>
-      </w:r>
-    </w:p>
-    <w:p>
-      <w:pPr>
-        <w:rPr>
-          <w:lang w:val="sv-SE"/>
-        </w:rPr>
-      </w:pPr>
-      <w:r>
-        <w:rPr>
-          <w:lang w:val="sv-SE"/>
-        </w:rPr>
-        <w:t>Såklart kan det vara att man glömmer fylla i någon timme, men ibland försvann hela individer. </w:t>
-      </w:r>
-    </w:p>
-    <w:p>
-      <w:pPr>
-        <w:rPr>
-          <w:lang w:val="sv-SE"/>
-        </w:rPr>
-      </w:pPr>
-      <w:r>
-        <w:rPr>
-          <w:lang w:val="sv-SE"/>
-        </w:rPr>
-        <w:t>På detta vis så finns alla ALLTID kvar på sina Utgångspunkter och ingen timme ska riskeras att missas då man har ett standard schema.  </w:t>
-      </w:r>
-    </w:p>
-    <w:p>
-      <w:pPr>
-        <w:rPr>
-          <w:lang w:val="sv-SE"/>
-        </w:rPr>
-      </w:pPr>
-      <w:r>
-        <w:rPr>
-          <w:lang w:val="sv-SE"/>
-        </w:rPr>
-        <w:t>Exempel: </w:t>
-      </w:r>
-    </w:p>
-    <w:p>
-      <w:pPr>
-        <w:rPr>
-          <w:lang w:val="sv-SE"/>
-        </w:rPr>
-      </w:pPr>
-      <w:r>
-        <w:rPr>
-          <w:lang w:val="sv-SE"/>
-        </w:rPr>
-        <w:t> </w:t>
-      </w:r>
-    </w:p>
-    <w:p>
-      <w:pPr>
-        <w:rPr>
-          <w:lang w:val="sv-SE"/>
-        </w:rPr>
-      </w:pPr>
-      <w:r>
-        <w:rPr>
-          <w:lang w:val="sv-SE"/>
-        </w:rPr>
-        <w:t>Man ändrar det under dagen som går: </w:t>
-      </w:r>
-    </w:p>
-    <w:p>
-      <w:pPr>
-        <w:rPr>
-          <w:lang w:val="sv-SE"/>
-        </w:rPr>
-      </w:pPr>
-      <w:r>
-        <w:rPr>
-          <w:lang w:val="sv-SE"/>
-        </w:rPr>
-        <w:t> </w:t>
-      </w:r>
-    </w:p>
-    <w:p>
-      <w:pPr>
-        <w:rPr>
-          <w:lang w:val="sv-SE"/>
-        </w:rPr>
-      </w:pPr>
-      <w:r>
-        <w:rPr>
-          <w:lang w:val="sv-SE"/>
-        </w:rPr>
         <w:t>Här nedan så kommer jag sedan att se på Granngårdens sida att jag i morse inte hade något att sortera. Men vid lunch sen ser jag att jag har fått 6 timmar. (om mot förmodan att jag glömt att jag bett om hjälp, eller missat att jag har fått hjälp). Då korrigerar jag det därefter. </w:t>
       </w:r>
     </w:p>
@@ -1780,7 +1747,6 @@
         <w:rPr>
           <w:lang w:val="sv-SE"/>
         </w:rPr>
-        <w:lastRenderedPageBreak/>
         <w:t>---------------------------------------------</w:t>
       </w:r>
     </w:p>
@@ -1807,7 +1773,21 @@
         <w:rPr>
           <w:lang w:val="sv-SE"/>
         </w:rPr>
-        <w:t>Har man "infinity" vy i bemanning så missar man inte detta, men det är så många namn som man "inte behöver se". </w:t>
+        <w:t>Har man "</w:t>
+      </w:r>
+      <w:proofErr w:type="spellStart"/>
+      <w:r>
+        <w:rPr>
+          <w:lang w:val="sv-SE"/>
+        </w:rPr>
+        <w:t>infinity</w:t>
+      </w:r>
+      <w:proofErr w:type="spellEnd"/>
+      <w:r>
+        <w:rPr>
+          <w:lang w:val="sv-SE"/>
+        </w:rPr>
+        <w:t>" vy i bemanning så missar man inte detta, men det är så många namn som man "inte behöver se". </w:t>
       </w:r>
     </w:p>
     <w:p>
@@ -1891,18 +1871,18 @@
     <w:p>
       <w:pPr>
         <w:rPr>
-          <w:lang w:val="en-US"/>
-        </w:rPr>
-      </w:pPr>
-      <w:r>
-        <w:rPr>
-          <w:lang w:val="sv-SE"/>
-        </w:rPr>
-        <w:t> </w:t>
-      </w:r>
-      <w:r>
-        <w:rPr>
-          <w:lang w:val="en-US"/>
+          <w:lang w:val="sv-SE"/>
+        </w:rPr>
+      </w:pPr>
+      <w:r>
+        <w:rPr>
+          <w:lang w:val="sv-SE"/>
+        </w:rPr>
+        <w:t> </w:t>
+      </w:r>
+      <w:r>
+        <w:rPr>
+          <w:lang w:val="sv-SE"/>
         </w:rPr>
         <w:t>---------------------------------------</w:t>
       </w:r>
@@ -1926,7 +1906,21 @@
         <w:rPr>
           <w:lang w:val="sv-SE"/>
         </w:rPr>
-        <w:t>vart de är schemalagda, bli pingade vid förändringar</w:t>
+        <w:t xml:space="preserve">vart de är schemalagda, bli </w:t>
+      </w:r>
+      <w:proofErr w:type="spellStart"/>
+      <w:r>
+        <w:rPr>
+          <w:lang w:val="sv-SE"/>
+        </w:rPr>
+        <w:t>pingade</w:t>
+      </w:r>
+      <w:proofErr w:type="spellEnd"/>
+      <w:r>
+        <w:rPr>
+          <w:lang w:val="sv-SE"/>
+        </w:rPr>
+        <w:t xml:space="preserve"> vid förändringar</w:t>
       </w:r>
       <w:r>
         <w:rPr>
@@ -1979,6 +1973,7 @@
         <w:rPr>
           <w:lang w:val="sv-SE"/>
         </w:rPr>
+        <w:lastRenderedPageBreak/>
         <w:t>Vi vill vidareutveckla bemanningskalkylen för att få en mer träffsäker och datadriven planering på både Granngården och Mestergruppen. Målet är att få bättre kontroll över bemanning, flöden och resursfördelning under dagen. </w:t>
       </w:r>
     </w:p>
@@ -2016,7 +2011,21 @@
           <w:lang w:val="sv-SE"/>
         </w:rPr>
         <w:br/>
-        <w:t>• Helpall </w:t>
+        <w:t xml:space="preserve">• </w:t>
+      </w:r>
+      <w:proofErr w:type="spellStart"/>
+      <w:r>
+        <w:rPr>
+          <w:lang w:val="sv-SE"/>
+        </w:rPr>
+        <w:t>Helpall</w:t>
+      </w:r>
+      <w:proofErr w:type="spellEnd"/>
+      <w:r>
+        <w:rPr>
+          <w:lang w:val="sv-SE"/>
+        </w:rPr>
+        <w:t> </w:t>
       </w:r>
       <w:r>
         <w:rPr>
@@ -2095,12 +2104,6 @@
           <w:lang w:val="sv-SE"/>
         </w:rPr>
         <w:br/>
-      </w:r>
-      <w:r>
-        <w:rPr>
-          <w:lang w:val="sv-SE"/>
-        </w:rPr>
-        <w:lastRenderedPageBreak/>
         <w:t>• Första halvan av dagen </w:t>
       </w:r>
       <w:r>
@@ -2273,6 +2276,12 @@
           <w:lang w:val="sv-SE"/>
         </w:rPr>
         <w:br/>
+      </w:r>
+      <w:r>
+        <w:rPr>
+          <w:lang w:val="sv-SE"/>
+        </w:rPr>
+        <w:lastRenderedPageBreak/>
         <w:t>• timmar andra halvan </w:t>
       </w:r>
       <w:r>
@@ -2426,7 +2435,6 @@
         <w:rPr>
           <w:lang w:val="sv-SE"/>
         </w:rPr>
-        <w:lastRenderedPageBreak/>
         <w:t>Exempel: </w:t>
       </w:r>
       <w:r>
@@ -2441,7 +2449,21 @@
           <w:lang w:val="sv-SE"/>
         </w:rPr>
         <w:br/>
-        <w:t>• historisk snitttid: 25 sekunder per pall </w:t>
+        <w:t xml:space="preserve">• historisk </w:t>
+      </w:r>
+      <w:proofErr w:type="spellStart"/>
+      <w:r>
+        <w:rPr>
+          <w:lang w:val="sv-SE"/>
+        </w:rPr>
+        <w:t>snitttid</w:t>
+      </w:r>
+      <w:proofErr w:type="spellEnd"/>
+      <w:r>
+        <w:rPr>
+          <w:lang w:val="sv-SE"/>
+        </w:rPr>
+        <w:t>: 25 sekunder per pall </w:t>
       </w:r>
       <w:r>
         <w:rPr>
@@ -2560,7 +2582,25 @@
           <w:bCs/>
           <w:lang w:val="sv-SE"/>
         </w:rPr>
-        <w:t>Sortering av kunder i helhetsvyn </w:t>
+        <w:t xml:space="preserve">Sortering av kunder i </w:t>
+      </w:r>
+      <w:proofErr w:type="spellStart"/>
+      <w:r>
+        <w:rPr>
+          <w:b/>
+          <w:bCs/>
+          <w:lang w:val="sv-SE"/>
+        </w:rPr>
+        <w:t>helhetsvyn</w:t>
+      </w:r>
+      <w:proofErr w:type="spellEnd"/>
+      <w:r>
+        <w:rPr>
+          <w:b/>
+          <w:bCs/>
+          <w:lang w:val="sv-SE"/>
+        </w:rPr>
+        <w:t> </w:t>
       </w:r>
     </w:p>
     <w:p>
@@ -2597,6 +2637,12 @@
           <w:lang w:val="sv-SE"/>
         </w:rPr>
         <w:br/>
+      </w:r>
+      <w:r>
+        <w:rPr>
+          <w:lang w:val="sv-SE"/>
+        </w:rPr>
+        <w:lastRenderedPageBreak/>
         <w:t>1. Mestergruppen </w:t>
       </w:r>
       <w:r>
@@ -2625,7 +2671,21 @@
           <w:lang w:val="sv-SE"/>
         </w:rPr>
         <w:br/>
-        <w:t>Detta skulle göra helhetsvyn betydligt enklare att läsa av snabbt. </w:t>
+        <w:t xml:space="preserve">Detta skulle göra </w:t>
+      </w:r>
+      <w:proofErr w:type="spellStart"/>
+      <w:r>
+        <w:rPr>
+          <w:lang w:val="sv-SE"/>
+        </w:rPr>
+        <w:t>helhetsvyn</w:t>
+      </w:r>
+      <w:proofErr w:type="spellEnd"/>
+      <w:r>
+        <w:rPr>
+          <w:lang w:val="sv-SE"/>
+        </w:rPr>
+        <w:t xml:space="preserve"> betydligt enklare att läsa av snabbt. </w:t>
       </w:r>
     </w:p>
     <w:p>
@@ -3052,9 +3112,6 @@
     <w:name w:val="Normal"/>
     <w:qFormat/>
     <w:rsid w:val="00437CA8"/>
-    <w:rPr>
-      <w:lang/>
-    </w:rPr>
   </w:style>
   <w:style w:type="paragraph" w:styleId="Rubrik1">
     <w:name w:val="heading 1"/>

</xml_diff>

<commit_message>
Fixa ytkarta och lagerfloden
</commit_message>
<xml_diff>
--- a/påg.docx
+++ b/påg.docx
@@ -2,126 +2,6 @@
 <file path=word/document.xml><?xml version="1.0" encoding="utf-8"?>
 <w:document xmlns:wpc="http://schemas.microsoft.com/office/word/2010/wordprocessingCanvas" xmlns:cx="http://schemas.microsoft.com/office/drawing/2014/chartex" xmlns:cx1="http://schemas.microsoft.com/office/drawing/2015/9/8/chartex" xmlns:cx2="http://schemas.microsoft.com/office/drawing/2015/10/21/chartex" xmlns:cx3="http://schemas.microsoft.com/office/drawing/2016/5/9/chartex" xmlns:cx4="http://schemas.microsoft.com/office/drawing/2016/5/10/chartex" xmlns:cx5="http://schemas.microsoft.com/office/drawing/2016/5/11/chartex" xmlns:cx6="http://schemas.microsoft.com/office/drawing/2016/5/12/chartex" xmlns:cx7="http://schemas.microsoft.com/office/drawing/2016/5/13/chartex" xmlns:cx8="http://schemas.microsoft.com/office/drawing/2016/5/14/chartex" xmlns:mc="http://schemas.openxmlformats.org/markup-compatibility/2006" xmlns:aink="http://schemas.microsoft.com/office/drawing/2016/ink" xmlns:am3d="http://schemas.microsoft.com/office/drawing/2017/model3d" xmlns:o="urn:schemas-microsoft-com:office:office" xmlns:oel="http://schemas.microsoft.com/office/2019/extlst" xmlns:r="http://schemas.openxmlformats.org/officeDocument/2006/relationships" xmlns:m="http://schemas.openxmlformats.org/officeDocument/2006/math" xmlns:v="urn:schemas-microsoft-com:vml" xmlns:wp14="http://schemas.microsoft.com/office/word/2010/wordprocessingDrawing" xmlns:wp="http://schemas.openxmlformats.org/drawingml/2006/wordprocessingDrawing" xmlns:w10="urn:schemas-microsoft-com:office:word" xmlns:w="http://schemas.openxmlformats.org/wordprocessingml/2006/main" xmlns:w14="http://schemas.microsoft.com/office/word/2010/wordml" xmlns:w15="http://schemas.microsoft.com/office/word/2012/wordml" xmlns:w16cex="http://schemas.microsoft.com/office/word/2018/wordml/cex" xmlns:w16cid="http://schemas.microsoft.com/office/word/2016/wordml/cid" xmlns:w16="http://schemas.microsoft.com/office/word/2018/wordml" xmlns:w16du="http://schemas.microsoft.com/office/word/2023/wordml/word16du" xmlns:w16sdtdh="http://schemas.microsoft.com/office/word/2020/wordml/sdtdatahash" xmlns:w16sdtfl="http://schemas.microsoft.com/office/word/2024/wordml/sdtformatlock" xmlns:w16se="http://schemas.microsoft.com/office/word/2015/wordml/symex" xmlns:wpg="http://schemas.microsoft.com/office/word/2010/wordprocessingGroup" xmlns:wpi="http://schemas.microsoft.com/office/word/2010/wordprocessingInk" xmlns:wne="http://schemas.microsoft.com/office/word/2006/wordml" xmlns:wps="http://schemas.microsoft.com/office/word/2010/wordprocessingShape" mc:Ignorable="w14 w15 w16se w16cid w16 w16cex w16sdtdh w16sdtfl w16du wp14">
   <w:body>
-    <w:p>
-      <w:pPr>
-        <w:rPr>
-          <w:lang w:val="sv-SE"/>
-        </w:rPr>
-      </w:pPr>
-      <w:r>
-        <w:rPr>
-          <w:lang w:val="sv-SE"/>
-        </w:rPr>
-        <w:t xml:space="preserve">Hej Hopp! </w:t>
-      </w:r>
-      <w:r>
-        <w:rPr>
-          <w:lang w:val="sv-SE"/>
-        </w:rPr>
-        <w:br/>
-      </w:r>
-      <w:r>
-        <w:rPr>
-          <w:lang w:val="sv-SE"/>
-        </w:rPr>
-        <w:br/>
-        <w:t>Här kommer lite förslag på vad som kan uppdateras i Stigamo.nu</w:t>
-      </w:r>
-      <w:r>
-        <w:rPr>
-          <w:lang w:val="sv-SE"/>
-        </w:rPr>
-        <w:br/>
-      </w:r>
-      <w:r>
-        <w:rPr>
-          <w:lang w:val="sv-SE"/>
-        </w:rPr>
-        <w:br/>
-        <w:t xml:space="preserve">1. Timmar: </w:t>
-      </w:r>
-      <w:r>
-        <w:rPr>
-          <w:lang w:val="sv-SE"/>
-        </w:rPr>
-        <w:br/>
-      </w:r>
-      <w:r>
-        <w:rPr>
-          <w:lang w:val="sv-SE"/>
-        </w:rPr>
-        <w:tab/>
-        <w:t xml:space="preserve">Att man behöver ha alla avdelningar uppe samtidigt när man ska se sina timmar. </w:t>
-      </w:r>
-      <w:r>
-        <w:rPr>
-          <w:lang w:val="sv-SE"/>
-        </w:rPr>
-        <w:br/>
-        <w:t xml:space="preserve">  </w:t>
-      </w:r>
-      <w:r>
-        <w:rPr>
-          <w:lang w:val="sv-SE"/>
-        </w:rPr>
-        <w:tab/>
-        <w:t xml:space="preserve">                                     </w:t>
-      </w:r>
-      <w:r>
-        <w:rPr>
-          <w:noProof/>
-          <w:lang w:val="sv-SE"/>
-        </w:rPr>
-        <w:drawing>
-          <wp:inline distT="0" distB="0" distL="0" distR="0" wp14:anchorId="74E37651" wp14:editId="553EF33E">
-            <wp:extent cx="2551420" cy="2752725"/>
-            <wp:effectExtent l="0" t="0" r="1905" b="0"/>
-            <wp:docPr id="1350054965" name="Bildobjekt 1"/>
-            <wp:cNvGraphicFramePr>
-              <a:graphicFrameLocks xmlns:a="http://schemas.openxmlformats.org/drawingml/2006/main" noChangeAspect="1"/>
-            </wp:cNvGraphicFramePr>
-            <a:graphic xmlns:a="http://schemas.openxmlformats.org/drawingml/2006/main">
-              <a:graphicData uri="http://schemas.openxmlformats.org/drawingml/2006/picture">
-                <pic:pic xmlns:pic="http://schemas.openxmlformats.org/drawingml/2006/picture">
-                  <pic:nvPicPr>
-                    <pic:cNvPr id="1350054965" name=""/>
-                    <pic:cNvPicPr/>
-                  </pic:nvPicPr>
-                  <pic:blipFill>
-                    <a:blip r:embed="rId4"/>
-                    <a:stretch>
-                      <a:fillRect/>
-                    </a:stretch>
-                  </pic:blipFill>
-                  <pic:spPr>
-                    <a:xfrm>
-                      <a:off x="0" y="0"/>
-                      <a:ext cx="2554855" cy="2756431"/>
-                    </a:xfrm>
-                    <a:prstGeom prst="rect">
-                      <a:avLst/>
-                    </a:prstGeom>
-                  </pic:spPr>
-                </pic:pic>
-              </a:graphicData>
-            </a:graphic>
-          </wp:inline>
-        </w:drawing>
-      </w:r>
-      <w:r>
-        <w:rPr>
-          <w:lang w:val="sv-SE"/>
-        </w:rPr>
-        <w:br/>
-      </w:r>
-      <w:r>
-        <w:rPr>
-          <w:lang w:val="sv-SE"/>
-        </w:rPr>
-        <w:tab/>
-        <w:t>Hade man kunnat göra så att även om GG har exempelvis MG VAS när man har sorterat på MG så dyker ändå den upp i detta fält. Lika så då andra saker så som MG plock, MG VM eller liknande. Detta gör då att man inte behöver ha alla dessa uppe samtidigt utan det blir mycket snabbare att hittar. En bekvämhet kanske, men man riskerar inte att missa det.</w:t>
-      </w:r>
-    </w:p>
     <w:p>
       <w:pPr>
         <w:rPr>
@@ -172,7 +52,7 @@
                     <pic:cNvPicPr/>
                   </pic:nvPicPr>
                   <pic:blipFill>
-                    <a:blip r:embed="rId5" cstate="print">
+                    <a:blip r:embed="rId4" cstate="print">
                       <a:extLst>
                         <a:ext uri="{28A0092B-C50C-407E-A947-70E740481C1C}">
                           <a14:useLocalDpi xmlns:a14="http://schemas.microsoft.com/office/drawing/2010/main" val="0"/>
@@ -335,7 +215,6 @@
         <w:rPr>
           <w:lang w:val="sv-SE"/>
         </w:rPr>
-        <w:lastRenderedPageBreak/>
         <w:t xml:space="preserve">3. Produktivitet och %. </w:t>
       </w:r>
     </w:p>
@@ -656,7 +535,21 @@
         <w:rPr>
           <w:lang w:val="sv-SE"/>
         </w:rPr>
-        <w:t xml:space="preserve">Då vi aldrig planerar framåt att dem ska köra halvdagar, utan det tar vi dag för dag, tänker jag att istället för "blandat" kanske då det kan stå "delvis ledig". eller </w:t>
+        <w:t xml:space="preserve">Då vi aldrig planerar framåt att dem ska köra halvdagar, utan det tar vi dag för dag, tänker jag att </w:t>
+      </w:r>
+      <w:proofErr w:type="gramStart"/>
+      <w:r>
+        <w:rPr>
+          <w:lang w:val="sv-SE"/>
+        </w:rPr>
+        <w:t>istället</w:t>
+      </w:r>
+      <w:proofErr w:type="gramEnd"/>
+      <w:r>
+        <w:rPr>
+          <w:lang w:val="sv-SE"/>
+        </w:rPr>
+        <w:t xml:space="preserve"> för "blandat" kanske då det kan stå "delvis ledig". eller </w:t>
       </w:r>
       <w:proofErr w:type="spellStart"/>
       <w:r>
@@ -773,7 +666,7 @@
                     </pic:cNvPicPr>
                   </pic:nvPicPr>
                   <pic:blipFill>
-                    <a:blip r:embed="rId6">
+                    <a:blip r:embed="rId5">
                       <a:extLst>
                         <a:ext uri="{28A0092B-C50C-407E-A947-70E740481C1C}">
                           <a14:useLocalDpi xmlns:a14="http://schemas.microsoft.com/office/drawing/2010/main" val="0"/>
@@ -821,7 +714,6 @@
         <w:rPr>
           <w:lang w:val="sv-SE"/>
         </w:rPr>
-        <w:lastRenderedPageBreak/>
         <w:t> </w:t>
       </w:r>
     </w:p>
@@ -859,7 +751,7 @@
                     </pic:cNvPicPr>
                   </pic:nvPicPr>
                   <pic:blipFill>
-                    <a:blip r:embed="rId6">
+                    <a:blip r:embed="rId5">
                       <a:extLst>
                         <a:ext uri="{28A0092B-C50C-407E-A947-70E740481C1C}">
                           <a14:useLocalDpi xmlns:a14="http://schemas.microsoft.com/office/drawing/2010/main" val="0"/>
@@ -1145,6 +1037,7 @@
         <w:rPr>
           <w:lang w:val="sv-SE"/>
         </w:rPr>
+        <w:lastRenderedPageBreak/>
         <w:t>Ett sätt att få ut alla som är närvarande för dagen så att man vid samlingsplats kan bocka av alla arbetstagare. </w:t>
       </w:r>
     </w:p>
@@ -1275,6 +1168,231 @@
         <w:rPr>
           <w:lang w:val="sv-SE"/>
         </w:rPr>
+        <w:t> </w:t>
+      </w:r>
+    </w:p>
+    <w:p>
+      <w:pPr>
+        <w:rPr>
+          <w:lang w:val="sv-SE"/>
+        </w:rPr>
+      </w:pPr>
+      <w:r>
+        <w:rPr>
+          <w:lang w:val="sv-SE"/>
+        </w:rPr>
+        <w:t>Inte bara har jag skickat 1 kille i 5 timmar. Utan man ser också att Autostore har skickat 2 timmar. </w:t>
+      </w:r>
+    </w:p>
+    <w:p>
+      <w:pPr>
+        <w:rPr>
+          <w:lang w:val="sv-SE"/>
+        </w:rPr>
+      </w:pPr>
+      <w:r>
+        <w:rPr>
+          <w:lang w:val="sv-SE"/>
+        </w:rPr>
+        <w:t> </w:t>
+      </w:r>
+    </w:p>
+    <w:p>
+      <w:pPr>
+        <w:rPr>
+          <w:lang w:val="sv-SE"/>
+        </w:rPr>
+      </w:pPr>
+      <w:r>
+        <w:rPr>
+          <w:lang w:val="sv-SE"/>
+        </w:rPr>
+        <w:t xml:space="preserve">Då går Amir över till </w:t>
+      </w:r>
+      <w:proofErr w:type="spellStart"/>
+      <w:proofErr w:type="gramStart"/>
+      <w:r>
+        <w:rPr>
+          <w:lang w:val="sv-SE"/>
+        </w:rPr>
+        <w:t>GG's</w:t>
+      </w:r>
+      <w:proofErr w:type="spellEnd"/>
+      <w:proofErr w:type="gramEnd"/>
+      <w:r>
+        <w:rPr>
+          <w:lang w:val="sv-SE"/>
+        </w:rPr>
+        <w:t xml:space="preserve"> sida för att ändra det efter behovet som fanns. exempel: </w:t>
+      </w:r>
+    </w:p>
+    <w:p>
+      <w:pPr>
+        <w:rPr>
+          <w:lang w:val="sv-SE"/>
+        </w:rPr>
+      </w:pPr>
+      <w:r>
+        <w:rPr>
+          <w:lang w:val="sv-SE"/>
+        </w:rPr>
+        <w:t> </w:t>
+      </w:r>
+    </w:p>
+    <w:p>
+      <w:pPr>
+        <w:rPr>
+          <w:lang w:val="sv-SE"/>
+        </w:rPr>
+      </w:pPr>
+      <w:r>
+        <w:rPr>
+          <w:lang w:val="sv-SE"/>
+        </w:rPr>
+        <w:t>Då kommer sedan dessa 5 hamnar på VM och 2 timmar på Plock.</w:t>
+      </w:r>
+    </w:p>
+    <w:p>
+      <w:pPr>
+        <w:rPr>
+          <w:lang w:val="sv-SE"/>
+        </w:rPr>
+      </w:pPr>
+      <w:r>
+        <w:rPr>
+          <w:lang w:val="sv-SE"/>
+        </w:rPr>
+        <w:t> </w:t>
+      </w:r>
+    </w:p>
+    <w:p>
+      <w:pPr>
+        <w:rPr>
+          <w:lang w:val="sv-SE"/>
+        </w:rPr>
+      </w:pPr>
+      <w:r>
+        <w:rPr>
+          <w:lang w:val="sv-SE"/>
+        </w:rPr>
+        <w:t> </w:t>
+      </w:r>
+    </w:p>
+    <w:p>
+      <w:pPr>
+        <w:rPr>
+          <w:lang w:val="sv-SE"/>
+        </w:rPr>
+      </w:pPr>
+      <w:r>
+        <w:rPr>
+          <w:lang w:val="sv-SE"/>
+        </w:rPr>
+        <w:t> </w:t>
+      </w:r>
+    </w:p>
+    <w:p>
+      <w:pPr>
+        <w:rPr>
+          <w:lang w:val="sv-SE"/>
+        </w:rPr>
+      </w:pPr>
+      <w:r>
+        <w:rPr>
+          <w:lang w:val="sv-SE"/>
+        </w:rPr>
+        <w:t xml:space="preserve">På </w:t>
+      </w:r>
+      <w:proofErr w:type="gramStart"/>
+      <w:r>
+        <w:rPr>
+          <w:lang w:val="sv-SE"/>
+        </w:rPr>
+        <w:t>detta viset</w:t>
+      </w:r>
+      <w:proofErr w:type="gramEnd"/>
+      <w:r>
+        <w:rPr>
+          <w:lang w:val="sv-SE"/>
+        </w:rPr>
+        <w:t xml:space="preserve"> behöver den som skickar personen inte längre tänka på vad som händer utan det kan vara att det behövs flyttas runt, då sköter Amir detta. </w:t>
+      </w:r>
+    </w:p>
+    <w:p>
+      <w:pPr>
+        <w:rPr>
+          <w:lang w:val="sv-SE"/>
+        </w:rPr>
+      </w:pPr>
+      <w:r>
+        <w:rPr>
+          <w:lang w:val="sv-SE"/>
+        </w:rPr>
+        <w:t> </w:t>
+      </w:r>
+    </w:p>
+    <w:p>
+      <w:pPr>
+        <w:rPr>
+          <w:lang w:val="sv-SE"/>
+        </w:rPr>
+      </w:pPr>
+      <w:r>
+        <w:rPr>
+          <w:lang w:val="sv-SE"/>
+        </w:rPr>
+        <w:t>Men för att inte missa det, så hamnar det på "Att Sortera". </w:t>
+      </w:r>
+    </w:p>
+    <w:p>
+      <w:pPr>
+        <w:rPr>
+          <w:lang w:val="sv-SE"/>
+        </w:rPr>
+      </w:pPr>
+      <w:r>
+        <w:rPr>
+          <w:lang w:val="sv-SE"/>
+        </w:rPr>
+        <w:t>Skulle man glömma att ändra det till MG VM eller MG Plock som i detta exempel. </w:t>
+      </w:r>
+    </w:p>
+    <w:p>
+      <w:pPr>
+        <w:rPr>
+          <w:lang w:val="sv-SE"/>
+        </w:rPr>
+      </w:pPr>
+      <w:r>
+        <w:rPr>
+          <w:lang w:val="sv-SE"/>
+        </w:rPr>
+        <w:t> </w:t>
+      </w:r>
+    </w:p>
+    <w:p>
+      <w:pPr>
+        <w:rPr>
+          <w:lang w:val="sv-SE"/>
+        </w:rPr>
+      </w:pPr>
+      <w:r>
+        <w:rPr>
+          <w:lang w:val="sv-SE"/>
+        </w:rPr>
+        <w:t>Så räknas "Mestergruppen" som Stöd timmar. </w:t>
+      </w:r>
+    </w:p>
+    <w:p>
+      <w:pPr>
+        <w:rPr>
+          <w:lang w:val="sv-SE"/>
+        </w:rPr>
+      </w:pPr>
+      <w:r>
+        <w:rPr>
+          <w:lang w:val="sv-SE"/>
+        </w:rPr>
         <w:lastRenderedPageBreak/>
         <w:t> </w:t>
       </w:r>
@@ -1289,334 +1407,358 @@
         <w:rPr>
           <w:lang w:val="sv-SE"/>
         </w:rPr>
-        <w:t>Inte bara har jag skickat 1 kille i 5 timmar. Utan man ser också att Autostore har skickat 2 timmar. </w:t>
-      </w:r>
-    </w:p>
-    <w:p>
-      <w:pPr>
-        <w:rPr>
-          <w:lang w:val="sv-SE"/>
-        </w:rPr>
-      </w:pPr>
-      <w:r>
-        <w:rPr>
-          <w:lang w:val="sv-SE"/>
-        </w:rPr>
-        <w:t> </w:t>
-      </w:r>
-    </w:p>
-    <w:p>
-      <w:pPr>
-        <w:rPr>
-          <w:lang w:val="sv-SE"/>
-        </w:rPr>
-      </w:pPr>
-      <w:r>
-        <w:rPr>
-          <w:lang w:val="sv-SE"/>
-        </w:rPr>
-        <w:t xml:space="preserve">Då går Amir över till </w:t>
+        <w:t> </w:t>
+      </w:r>
+    </w:p>
+    <w:p>
+      <w:pPr>
+        <w:rPr>
+          <w:lang w:val="sv-SE"/>
+        </w:rPr>
+      </w:pPr>
+      <w:r>
+        <w:rPr>
+          <w:lang w:val="sv-SE"/>
+        </w:rPr>
+        <w:t>---------------------</w:t>
+      </w:r>
+    </w:p>
+    <w:p>
+      <w:pPr>
+        <w:rPr>
+          <w:lang w:val="sv-SE"/>
+        </w:rPr>
+      </w:pPr>
+      <w:r>
+        <w:rPr>
+          <w:lang w:val="sv-SE"/>
+        </w:rPr>
+        <w:t> </w:t>
+      </w:r>
+    </w:p>
+    <w:p>
+      <w:pPr>
+        <w:rPr>
+          <w:lang w:val="sv-SE"/>
+        </w:rPr>
+      </w:pPr>
+      <w:r>
+        <w:rPr>
+          <w:lang w:val="sv-SE"/>
+        </w:rPr>
+        <w:t xml:space="preserve">Detta skapades </w:t>
+      </w:r>
+      <w:proofErr w:type="gramStart"/>
+      <w:r>
+        <w:rPr>
+          <w:lang w:val="sv-SE"/>
+        </w:rPr>
+        <w:t>eftersom att</w:t>
+      </w:r>
+      <w:proofErr w:type="gramEnd"/>
+      <w:r>
+        <w:rPr>
+          <w:lang w:val="sv-SE"/>
+        </w:rPr>
+        <w:t xml:space="preserve"> vi varje månad diffade på vad som fanns i </w:t>
       </w:r>
       <w:proofErr w:type="spellStart"/>
       <w:r>
         <w:rPr>
           <w:lang w:val="sv-SE"/>
         </w:rPr>
-        <w:t>GG's</w:t>
+        <w:t>agda</w:t>
       </w:r>
       <w:proofErr w:type="spellEnd"/>
       <w:r>
         <w:rPr>
           <w:lang w:val="sv-SE"/>
         </w:rPr>
-        <w:t xml:space="preserve"> sida för att ändra det efter behovet som fanns. exempel: </w:t>
-      </w:r>
-    </w:p>
-    <w:p>
-      <w:pPr>
-        <w:rPr>
-          <w:lang w:val="sv-SE"/>
-        </w:rPr>
-      </w:pPr>
-      <w:r>
-        <w:rPr>
-          <w:lang w:val="sv-SE"/>
-        </w:rPr>
-        <w:t> </w:t>
-      </w:r>
-    </w:p>
-    <w:p>
-      <w:pPr>
-        <w:rPr>
-          <w:lang w:val="sv-SE"/>
-        </w:rPr>
-      </w:pPr>
-      <w:r>
-        <w:rPr>
-          <w:lang w:val="sv-SE"/>
-        </w:rPr>
-        <w:t>Då kommer sedan dessa 5 hamnar på VM och 2 timmar på Plock.</w:t>
-      </w:r>
-    </w:p>
-    <w:p>
-      <w:pPr>
-        <w:rPr>
-          <w:lang w:val="sv-SE"/>
-        </w:rPr>
-      </w:pPr>
-      <w:r>
-        <w:rPr>
-          <w:lang w:val="sv-SE"/>
-        </w:rPr>
-        <w:t> </w:t>
-      </w:r>
-    </w:p>
-    <w:p>
-      <w:pPr>
-        <w:rPr>
-          <w:lang w:val="sv-SE"/>
-        </w:rPr>
-      </w:pPr>
-      <w:r>
-        <w:rPr>
-          <w:lang w:val="sv-SE"/>
-        </w:rPr>
-        <w:t> </w:t>
-      </w:r>
-    </w:p>
-    <w:p>
-      <w:pPr>
-        <w:rPr>
-          <w:lang w:val="sv-SE"/>
-        </w:rPr>
-      </w:pPr>
-      <w:r>
-        <w:rPr>
-          <w:lang w:val="sv-SE"/>
-        </w:rPr>
-        <w:t> </w:t>
-      </w:r>
-    </w:p>
-    <w:p>
-      <w:pPr>
-        <w:rPr>
-          <w:lang w:val="sv-SE"/>
-        </w:rPr>
-      </w:pPr>
-      <w:r>
-        <w:rPr>
-          <w:lang w:val="sv-SE"/>
-        </w:rPr>
-        <w:t>På detta viset behöver den som skickar personen inte längre tänka på vad som händer utan det kan vara att det behövs flyttas runt, då sköter Amir detta. </w:t>
-      </w:r>
-    </w:p>
-    <w:p>
-      <w:pPr>
-        <w:rPr>
-          <w:lang w:val="sv-SE"/>
-        </w:rPr>
-      </w:pPr>
-      <w:r>
-        <w:rPr>
-          <w:lang w:val="sv-SE"/>
-        </w:rPr>
-        <w:t> </w:t>
-      </w:r>
-    </w:p>
-    <w:p>
-      <w:pPr>
-        <w:rPr>
-          <w:lang w:val="sv-SE"/>
-        </w:rPr>
-      </w:pPr>
-      <w:r>
-        <w:rPr>
-          <w:lang w:val="sv-SE"/>
-        </w:rPr>
-        <w:t>Men för att inte missa det, så hamnar det på "Att Sortera". </w:t>
-      </w:r>
-    </w:p>
-    <w:p>
-      <w:pPr>
-        <w:rPr>
-          <w:lang w:val="sv-SE"/>
-        </w:rPr>
-      </w:pPr>
-      <w:r>
-        <w:rPr>
-          <w:lang w:val="sv-SE"/>
-        </w:rPr>
-        <w:t>Skulle man glömma att ändra det till MG VM eller MG Plock som i detta exempel. </w:t>
-      </w:r>
-    </w:p>
-    <w:p>
-      <w:pPr>
-        <w:rPr>
-          <w:lang w:val="sv-SE"/>
-        </w:rPr>
-      </w:pPr>
-      <w:r>
-        <w:rPr>
-          <w:lang w:val="sv-SE"/>
-        </w:rPr>
-        <w:t> </w:t>
-      </w:r>
-    </w:p>
-    <w:p>
-      <w:pPr>
-        <w:rPr>
-          <w:lang w:val="sv-SE"/>
-        </w:rPr>
-      </w:pPr>
-      <w:r>
-        <w:rPr>
-          <w:lang w:val="sv-SE"/>
-        </w:rPr>
-        <w:t>Så räknas "Mestergruppen" som Stöd timmar. </w:t>
-      </w:r>
-    </w:p>
-    <w:p>
-      <w:pPr>
-        <w:rPr>
-          <w:lang w:val="sv-SE"/>
-        </w:rPr>
-      </w:pPr>
-      <w:r>
-        <w:rPr>
-          <w:lang w:val="sv-SE"/>
-        </w:rPr>
-        <w:t> </w:t>
-      </w:r>
-    </w:p>
-    <w:p>
-      <w:pPr>
-        <w:rPr>
-          <w:lang w:val="sv-SE"/>
-        </w:rPr>
-      </w:pPr>
-      <w:r>
-        <w:rPr>
-          <w:lang w:val="sv-SE"/>
-        </w:rPr>
-        <w:t> </w:t>
-      </w:r>
-    </w:p>
-    <w:p>
-      <w:pPr>
-        <w:rPr>
-          <w:lang w:val="sv-SE"/>
-        </w:rPr>
-      </w:pPr>
-      <w:r>
-        <w:rPr>
-          <w:lang w:val="sv-SE"/>
-        </w:rPr>
-        <w:t>---------------------</w:t>
-      </w:r>
-    </w:p>
-    <w:p>
-      <w:pPr>
-        <w:rPr>
-          <w:lang w:val="sv-SE"/>
-        </w:rPr>
-      </w:pPr>
-      <w:r>
-        <w:rPr>
-          <w:lang w:val="sv-SE"/>
-        </w:rPr>
-        <w:t> </w:t>
-      </w:r>
-    </w:p>
-    <w:p>
-      <w:pPr>
-        <w:rPr>
-          <w:lang w:val="sv-SE"/>
-        </w:rPr>
-      </w:pPr>
-      <w:r>
-        <w:rPr>
-          <w:lang w:val="sv-SE"/>
-        </w:rPr>
-        <w:t xml:space="preserve">Detta skapades eftersom att vi varje månad diffade på vad som fanns i </w:t>
+        <w:t xml:space="preserve"> kontra bemanningsfilen. </w:t>
+      </w:r>
+    </w:p>
+    <w:p>
+      <w:pPr>
+        <w:rPr>
+          <w:lang w:val="sv-SE"/>
+        </w:rPr>
+      </w:pPr>
+      <w:r>
+        <w:rPr>
+          <w:lang w:val="sv-SE"/>
+        </w:rPr>
+        <w:t>Såklart kan det vara att man glömmer fylla i någon timme, men ibland försvann hela individer. </w:t>
+      </w:r>
+    </w:p>
+    <w:p>
+      <w:pPr>
+        <w:rPr>
+          <w:lang w:val="sv-SE"/>
+        </w:rPr>
+      </w:pPr>
+      <w:r>
+        <w:rPr>
+          <w:lang w:val="sv-SE"/>
+        </w:rPr>
+        <w:t xml:space="preserve">På detta vis så finns alla ALLTID kvar på sina Utgångspunkter och ingen timme ska riskeras att missas då man har ett </w:t>
+      </w:r>
+      <w:proofErr w:type="gramStart"/>
+      <w:r>
+        <w:rPr>
+          <w:lang w:val="sv-SE"/>
+        </w:rPr>
+        <w:t>standard schema</w:t>
+      </w:r>
+      <w:proofErr w:type="gramEnd"/>
+      <w:r>
+        <w:rPr>
+          <w:lang w:val="sv-SE"/>
+        </w:rPr>
+        <w:t>.  </w:t>
+      </w:r>
+    </w:p>
+    <w:p>
+      <w:pPr>
+        <w:rPr>
+          <w:lang w:val="sv-SE"/>
+        </w:rPr>
+      </w:pPr>
+      <w:r>
+        <w:rPr>
+          <w:lang w:val="sv-SE"/>
+        </w:rPr>
+        <w:t>Exempel: </w:t>
+      </w:r>
+    </w:p>
+    <w:p>
+      <w:pPr>
+        <w:rPr>
+          <w:lang w:val="sv-SE"/>
+        </w:rPr>
+      </w:pPr>
+      <w:r>
+        <w:rPr>
+          <w:lang w:val="sv-SE"/>
+        </w:rPr>
+        <w:t> </w:t>
+      </w:r>
+    </w:p>
+    <w:p>
+      <w:pPr>
+        <w:rPr>
+          <w:lang w:val="sv-SE"/>
+        </w:rPr>
+      </w:pPr>
+      <w:r>
+        <w:rPr>
+          <w:lang w:val="sv-SE"/>
+        </w:rPr>
+        <w:t>Man ändrar det under dagen som går: </w:t>
+      </w:r>
+    </w:p>
+    <w:p>
+      <w:pPr>
+        <w:rPr>
+          <w:lang w:val="sv-SE"/>
+        </w:rPr>
+      </w:pPr>
+      <w:r>
+        <w:rPr>
+          <w:lang w:val="sv-SE"/>
+        </w:rPr>
+        <w:t> </w:t>
+      </w:r>
+    </w:p>
+    <w:p>
+      <w:pPr>
+        <w:rPr>
+          <w:lang w:val="sv-SE"/>
+        </w:rPr>
+      </w:pPr>
+      <w:r>
+        <w:rPr>
+          <w:lang w:val="sv-SE"/>
+        </w:rPr>
+        <w:t>Här nedan så kommer jag sedan att se på Granngårdens sida att jag i morse inte hade något att sortera. Men vid lunch sen ser jag att jag har fått 6 timmar. (om mot förmodan att jag glömt att jag bett om hjälp, eller missat att jag har fått hjälp). Då korrigerar jag det därefter. </w:t>
+      </w:r>
+    </w:p>
+    <w:p>
+      <w:pPr>
+        <w:rPr>
+          <w:lang w:val="sv-SE"/>
+        </w:rPr>
+      </w:pPr>
+      <w:r>
+        <w:rPr>
+          <w:lang w:val="sv-SE"/>
+        </w:rPr>
+        <w:t> </w:t>
+      </w:r>
+    </w:p>
+    <w:p>
+      <w:pPr>
+        <w:rPr>
+          <w:lang w:val="sv-SE"/>
+        </w:rPr>
+      </w:pPr>
+      <w:r>
+        <w:rPr>
+          <w:lang w:val="sv-SE"/>
+        </w:rPr>
+        <w:t> </w:t>
+      </w:r>
+    </w:p>
+    <w:p>
+      <w:pPr>
+        <w:rPr>
+          <w:lang w:val="sv-SE"/>
+        </w:rPr>
+      </w:pPr>
+      <w:r>
+        <w:rPr>
+          <w:lang w:val="sv-SE"/>
+        </w:rPr>
+        <w:t> </w:t>
+      </w:r>
+    </w:p>
+    <w:p>
+      <w:pPr>
+        <w:rPr>
+          <w:lang w:val="sv-SE"/>
+        </w:rPr>
+      </w:pPr>
+      <w:r>
+        <w:rPr>
+          <w:lang w:val="sv-SE"/>
+        </w:rPr>
+        <w:t xml:space="preserve">Blir </w:t>
+      </w:r>
+      <w:proofErr w:type="gramStart"/>
+      <w:r>
+        <w:rPr>
+          <w:lang w:val="sv-SE"/>
+        </w:rPr>
+        <w:t>istället</w:t>
+      </w:r>
+      <w:proofErr w:type="gramEnd"/>
+      <w:r>
+        <w:rPr>
+          <w:lang w:val="sv-SE"/>
+        </w:rPr>
+        <w:t xml:space="preserve"> </w:t>
+      </w:r>
+      <w:proofErr w:type="gramStart"/>
+      <w:r>
+        <w:rPr>
+          <w:lang w:val="sv-SE"/>
+        </w:rPr>
+        <w:t>då :</w:t>
+      </w:r>
+      <w:proofErr w:type="gramEnd"/>
+    </w:p>
+    <w:p>
+      <w:pPr>
+        <w:rPr>
+          <w:lang w:val="sv-SE"/>
+        </w:rPr>
+      </w:pPr>
+      <w:r>
+        <w:rPr>
+          <w:lang w:val="sv-SE"/>
+        </w:rPr>
+        <w:t> </w:t>
+      </w:r>
+    </w:p>
+    <w:p>
+      <w:pPr>
+        <w:rPr>
+          <w:lang w:val="sv-SE"/>
+        </w:rPr>
+      </w:pPr>
+      <w:r>
+        <w:rPr>
+          <w:lang w:val="sv-SE"/>
+        </w:rPr>
+        <w:t> </w:t>
+      </w:r>
+    </w:p>
+    <w:p>
+      <w:pPr>
+        <w:rPr>
+          <w:lang w:val="sv-SE"/>
+        </w:rPr>
+      </w:pPr>
+      <w:r>
+        <w:rPr>
+          <w:lang w:val="sv-SE"/>
+        </w:rPr>
+        <w:t> </w:t>
+      </w:r>
+    </w:p>
+    <w:p>
+      <w:pPr>
+        <w:rPr>
+          <w:lang w:val="sv-SE"/>
+        </w:rPr>
+      </w:pPr>
+      <w:r>
+        <w:rPr>
+          <w:lang w:val="sv-SE"/>
+        </w:rPr>
+        <w:t>---------------------------------------------</w:t>
+      </w:r>
+    </w:p>
+    <w:p>
+      <w:pPr>
+        <w:rPr>
+          <w:lang w:val="sv-SE"/>
+        </w:rPr>
+      </w:pPr>
+      <w:r>
+        <w:rPr>
+          <w:lang w:val="sv-SE"/>
+        </w:rPr>
+        <w:t> </w:t>
+      </w:r>
+    </w:p>
+    <w:p>
+      <w:pPr>
+        <w:rPr>
+          <w:lang w:val="sv-SE"/>
+        </w:rPr>
+      </w:pPr>
+      <w:r>
+        <w:rPr>
+          <w:lang w:val="sv-SE"/>
+        </w:rPr>
+        <w:t>Har man "</w:t>
       </w:r>
       <w:proofErr w:type="spellStart"/>
       <w:r>
         <w:rPr>
           <w:lang w:val="sv-SE"/>
         </w:rPr>
-        <w:t>agda</w:t>
+        <w:t>infinity</w:t>
       </w:r>
       <w:proofErr w:type="spellEnd"/>
       <w:r>
         <w:rPr>
           <w:lang w:val="sv-SE"/>
         </w:rPr>
-        <w:t xml:space="preserve"> kontra bemanningsfilen. </w:t>
-      </w:r>
-    </w:p>
-    <w:p>
-      <w:pPr>
-        <w:rPr>
-          <w:lang w:val="sv-SE"/>
-        </w:rPr>
-      </w:pPr>
-      <w:r>
-        <w:rPr>
-          <w:lang w:val="sv-SE"/>
-        </w:rPr>
-        <w:t>Såklart kan det vara att man glömmer fylla i någon timme, men ibland försvann hela individer. </w:t>
-      </w:r>
-    </w:p>
-    <w:p>
-      <w:pPr>
-        <w:rPr>
-          <w:lang w:val="sv-SE"/>
-        </w:rPr>
-      </w:pPr>
-      <w:r>
-        <w:rPr>
-          <w:lang w:val="sv-SE"/>
-        </w:rPr>
-        <w:t>På detta vis så finns alla ALLTID kvar på sina Utgångspunkter och ingen timme ska riskeras att missas då man har ett standard schema.  </w:t>
-      </w:r>
-    </w:p>
-    <w:p>
-      <w:pPr>
-        <w:rPr>
-          <w:lang w:val="sv-SE"/>
-        </w:rPr>
-      </w:pPr>
-      <w:r>
-        <w:rPr>
-          <w:lang w:val="sv-SE"/>
-        </w:rPr>
-        <w:t>Exempel: </w:t>
-      </w:r>
-    </w:p>
-    <w:p>
-      <w:pPr>
-        <w:rPr>
-          <w:lang w:val="sv-SE"/>
-        </w:rPr>
-      </w:pPr>
-      <w:r>
-        <w:rPr>
-          <w:lang w:val="sv-SE"/>
-        </w:rPr>
-        <w:t> </w:t>
-      </w:r>
-    </w:p>
-    <w:p>
-      <w:pPr>
-        <w:rPr>
-          <w:lang w:val="sv-SE"/>
-        </w:rPr>
-      </w:pPr>
-      <w:r>
-        <w:rPr>
-          <w:lang w:val="sv-SE"/>
-        </w:rPr>
-        <w:t>Man ändrar det under dagen som går: </w:t>
+        <w:t>" vy i bemanning så missar man inte detta, men det är så många namn som man "inte behöver se". </w:t>
+      </w:r>
+    </w:p>
+    <w:p>
+      <w:pPr>
+        <w:rPr>
+          <w:lang w:val="sv-SE"/>
+        </w:rPr>
+      </w:pPr>
+      <w:r>
+        <w:rPr>
+          <w:lang w:val="sv-SE"/>
+        </w:rPr>
+        <w:t>Har man sorterat på sin kund, men ändå kan se om någon "Aktiviteter" finns på andra ställen skulle det vara bra. </w:t>
       </w:r>
     </w:p>
     <w:p>
@@ -1630,189 +1772,6 @@
           <w:lang w:val="sv-SE"/>
         </w:rPr>
         <w:lastRenderedPageBreak/>
-        <w:t> </w:t>
-      </w:r>
-    </w:p>
-    <w:p>
-      <w:pPr>
-        <w:rPr>
-          <w:lang w:val="sv-SE"/>
-        </w:rPr>
-      </w:pPr>
-      <w:r>
-        <w:rPr>
-          <w:lang w:val="sv-SE"/>
-        </w:rPr>
-        <w:t>Här nedan så kommer jag sedan att se på Granngårdens sida att jag i morse inte hade något att sortera. Men vid lunch sen ser jag att jag har fått 6 timmar. (om mot förmodan att jag glömt att jag bett om hjälp, eller missat att jag har fått hjälp). Då korrigerar jag det därefter. </w:t>
-      </w:r>
-    </w:p>
-    <w:p>
-      <w:pPr>
-        <w:rPr>
-          <w:lang w:val="sv-SE"/>
-        </w:rPr>
-      </w:pPr>
-      <w:r>
-        <w:rPr>
-          <w:lang w:val="sv-SE"/>
-        </w:rPr>
-        <w:t> </w:t>
-      </w:r>
-    </w:p>
-    <w:p>
-      <w:pPr>
-        <w:rPr>
-          <w:lang w:val="sv-SE"/>
-        </w:rPr>
-      </w:pPr>
-      <w:r>
-        <w:rPr>
-          <w:lang w:val="sv-SE"/>
-        </w:rPr>
-        <w:t> </w:t>
-      </w:r>
-    </w:p>
-    <w:p>
-      <w:pPr>
-        <w:rPr>
-          <w:lang w:val="sv-SE"/>
-        </w:rPr>
-      </w:pPr>
-      <w:r>
-        <w:rPr>
-          <w:lang w:val="sv-SE"/>
-        </w:rPr>
-        <w:t> </w:t>
-      </w:r>
-    </w:p>
-    <w:p>
-      <w:pPr>
-        <w:rPr>
-          <w:lang w:val="sv-SE"/>
-        </w:rPr>
-      </w:pPr>
-      <w:r>
-        <w:rPr>
-          <w:lang w:val="sv-SE"/>
-        </w:rPr>
-        <w:t>Blir istället då :</w:t>
-      </w:r>
-    </w:p>
-    <w:p>
-      <w:pPr>
-        <w:rPr>
-          <w:lang w:val="sv-SE"/>
-        </w:rPr>
-      </w:pPr>
-      <w:r>
-        <w:rPr>
-          <w:lang w:val="sv-SE"/>
-        </w:rPr>
-        <w:t> </w:t>
-      </w:r>
-    </w:p>
-    <w:p>
-      <w:pPr>
-        <w:rPr>
-          <w:lang w:val="sv-SE"/>
-        </w:rPr>
-      </w:pPr>
-      <w:r>
-        <w:rPr>
-          <w:lang w:val="sv-SE"/>
-        </w:rPr>
-        <w:t> </w:t>
-      </w:r>
-    </w:p>
-    <w:p>
-      <w:pPr>
-        <w:rPr>
-          <w:lang w:val="sv-SE"/>
-        </w:rPr>
-      </w:pPr>
-      <w:r>
-        <w:rPr>
-          <w:lang w:val="sv-SE"/>
-        </w:rPr>
-        <w:t> </w:t>
-      </w:r>
-    </w:p>
-    <w:p>
-      <w:pPr>
-        <w:rPr>
-          <w:lang w:val="sv-SE"/>
-        </w:rPr>
-      </w:pPr>
-      <w:r>
-        <w:rPr>
-          <w:lang w:val="sv-SE"/>
-        </w:rPr>
-        <w:t>---------------------------------------------</w:t>
-      </w:r>
-    </w:p>
-    <w:p>
-      <w:pPr>
-        <w:rPr>
-          <w:lang w:val="sv-SE"/>
-        </w:rPr>
-      </w:pPr>
-      <w:r>
-        <w:rPr>
-          <w:lang w:val="sv-SE"/>
-        </w:rPr>
-        <w:t> </w:t>
-      </w:r>
-    </w:p>
-    <w:p>
-      <w:pPr>
-        <w:rPr>
-          <w:lang w:val="sv-SE"/>
-        </w:rPr>
-      </w:pPr>
-      <w:r>
-        <w:rPr>
-          <w:lang w:val="sv-SE"/>
-        </w:rPr>
-        <w:t>Har man "</w:t>
-      </w:r>
-      <w:proofErr w:type="spellStart"/>
-      <w:r>
-        <w:rPr>
-          <w:lang w:val="sv-SE"/>
-        </w:rPr>
-        <w:t>infinity</w:t>
-      </w:r>
-      <w:proofErr w:type="spellEnd"/>
-      <w:r>
-        <w:rPr>
-          <w:lang w:val="sv-SE"/>
-        </w:rPr>
-        <w:t>" vy i bemanning så missar man inte detta, men det är så många namn som man "inte behöver se". </w:t>
-      </w:r>
-    </w:p>
-    <w:p>
-      <w:pPr>
-        <w:rPr>
-          <w:lang w:val="sv-SE"/>
-        </w:rPr>
-      </w:pPr>
-      <w:r>
-        <w:rPr>
-          <w:lang w:val="sv-SE"/>
-        </w:rPr>
-        <w:t>Har man sorterat på sin kund, men ändå kan se om någon "Aktiviteter" finns på andra ställen skulle det vara bra. </w:t>
-      </w:r>
-    </w:p>
-    <w:p>
-      <w:pPr>
-        <w:rPr>
-          <w:lang w:val="sv-SE"/>
-        </w:rPr>
-      </w:pPr>
-      <w:r>
-        <w:rPr>
-          <w:lang w:val="sv-SE"/>
-        </w:rPr>
         <w:t> </w:t>
       </w:r>
     </w:p>
@@ -1973,7 +1932,6 @@
         <w:rPr>
           <w:lang w:val="sv-SE"/>
         </w:rPr>
-        <w:lastRenderedPageBreak/>
         <w:t>Vi vill vidareutveckla bemanningskalkylen för att få en mer träffsäker och datadriven planering på både Granngården och Mestergruppen. Målet är att få bättre kontroll över bemanning, flöden och resursfördelning under dagen. </w:t>
       </w:r>
     </w:p>
@@ -2169,6 +2127,12 @@
           <w:lang w:val="sv-SE"/>
         </w:rPr>
         <w:br/>
+      </w:r>
+      <w:r>
+        <w:rPr>
+          <w:lang w:val="sv-SE"/>
+        </w:rPr>
+        <w:lastRenderedPageBreak/>
         <w:t> </w:t>
       </w:r>
       <w:r>
@@ -2276,12 +2240,6 @@
           <w:lang w:val="sv-SE"/>
         </w:rPr>
         <w:br/>
-      </w:r>
-      <w:r>
-        <w:rPr>
-          <w:lang w:val="sv-SE"/>
-        </w:rPr>
-        <w:lastRenderedPageBreak/>
         <w:t>• timmar andra halvan </w:t>
       </w:r>
       <w:r>
@@ -2521,6 +2479,7 @@
         <w:rPr>
           <w:lang w:val="sv-SE"/>
         </w:rPr>
+        <w:lastRenderedPageBreak/>
         <w:t>Målet är att börja bemanna varumottagningen mer datadrivet och träffsäkert — på samma sätt som vi idag arbetar med produktionen. </w:t>
       </w:r>
     </w:p>
@@ -2616,7 +2575,21 @@
         <w:rPr>
           <w:lang w:val="sv-SE"/>
         </w:rPr>
-        <w:t>Vi vill kunna sortera kunderna i en fast ordning istället för att de ligger blandat. </w:t>
+        <w:t xml:space="preserve">Vi vill kunna sortera kunderna i en fast ordning </w:t>
+      </w:r>
+      <w:proofErr w:type="gramStart"/>
+      <w:r>
+        <w:rPr>
+          <w:lang w:val="sv-SE"/>
+        </w:rPr>
+        <w:t>istället</w:t>
+      </w:r>
+      <w:proofErr w:type="gramEnd"/>
+      <w:r>
+        <w:rPr>
+          <w:lang w:val="sv-SE"/>
+        </w:rPr>
+        <w:t xml:space="preserve"> för att de ligger blandat. </w:t>
       </w:r>
       <w:r>
         <w:rPr>
@@ -2637,12 +2610,6 @@
           <w:lang w:val="sv-SE"/>
         </w:rPr>
         <w:br/>
-      </w:r>
-      <w:r>
-        <w:rPr>
-          <w:lang w:val="sv-SE"/>
-        </w:rPr>
-        <w:lastRenderedPageBreak/>
         <w:t>1. Mestergruppen </w:t>
       </w:r>
       <w:r>

</xml_diff>